<commit_message>
cambio letra a poppins
</commit_message>
<xml_diff>
--- a/Web material deportivo control play.docx
+++ b/Web material deportivo control play.docx
@@ -146,6 +146,17 @@
         </w:rPr>
         <w:t>TEXTIL</w:t>
       </w:r>
+    </w:p>
+    <w:p>
+      <w:pPr>
+        <w:jc w:val="center"/>
+        <w:rPr>
+          <w:b/>
+          <w:bCs/>
+          <w:sz w:val="28"/>
+          <w:szCs w:val="28"/>
+        </w:rPr>
+      </w:pPr>
     </w:p>
     <w:p>
       <w:r>

</xml_diff>